<commit_message>
Update Reference 26 to exact published title and author list from BMC Public Health
</commit_message>
<xml_diff>
--- a/manuscript/Revised_Manuscript_Clean.docx
+++ b/manuscript/Revised_Manuscript_Clean.docx
@@ -501,7 +501,7 @@
         <w:spacing w:after="120"/>
       </w:pPr>
       <w:r>
-        <w:t>Although several studies have examined childhood undernutrition in Bangladesh using earlier DHS datasets [20], [22], [23], [24], important gaps remain in the current literature. First, relatively limited evidence has utilized the most recent BDHS 2022 data to simultaneously examine stunting, wasting, and underweight within a unified multilevel analytical framework. Recent BDHS 2022 studies have either relied on single-level logistic regressions without decomposing hierarchical clustering (e.g., Tamanna et al., 2025 [25]) or restricted their focus to specific subsets of undernutrition without comparing chronic and acute indices simultaneously (e.g., Rashid et al., 2026 [26]). Second, many previous studies did not incorporate child age alongside birth order and fertility variables into multilevel equations. Third, persistent regional and socioeconomic inequalities in childhood nutritional outcomes warrant updated evidence to guide geographically targeted nutrition interventions and policy responses in Bangladesh [23], [24].</w:t>
+        <w:t>Although several studies have examined childhood undernutrition in Bangladesh using earlier DHS datasets [20], [22], [23], [24], important gaps remain in the current literature. First, relatively limited evidence has utilized the most recent BDHS 2022 data to simultaneously examine stunting, wasting, and underweight within a unified multilevel analytical framework. Recent BDHS 2022 studies have either relied on single-level logistic regressions without decomposing hierarchical clustering (e.g., Tamanna et al., 2025 [25]) or focused primarily on spatial hotspot analysis via Bayesian methods (e.g., Rashid et al., 2026 [26]) without detailing variance decomposition across domestic infrastructure and the critical weaning transition within a unified frequentist framework. Second, many previous studies did not incorporate child age alongside birth order and fertility variables into multilevel equations. Third, persistent regional and socioeconomic inequalities in childhood nutritional outcomes warrant updated evidence to guide geographically targeted nutrition interventions and policy responses in Bangladesh [23], [24].</w:t>
       </w:r>
     </w:p>
     <w:p>
@@ -24319,7 +24319,7 @@
         <w:spacing w:after="120"/>
       </w:pPr>
       <w:r>
-        <w:t>Our findings distinguish themselves from and build upon recently published BDHS 2022 studies. Tamanna et al. (2025) [25] utilized single-level binary logistic regression and focused primarily on stunting determinants, failing to account for survey clustering or contextual community variance. Rashid et al. (2026) [26] evaluated spatio-demographic patterns across selected subpopulations but did not simultaneously evaluate all three WHO anthropometric indices within an identical hierarchical modeling framework. By analyzing stunting, wasting, and underweight simultaneously in a unified sample of 4,087 children, our study provides a direct comparative assessment that clarifies why chronic undernutrition requires long-term community infrastructure and educational investments, whereas acute wasting necessitates targeted maternal health and family planning support.</w:t>
+        <w:t>Our findings distinguish themselves from and build upon recently published BDHS 2022 studies. Tamanna et al. (2025) [25] utilized single-level binary logistic regression and focused primarily on stunting determinants, failing to account for survey clustering or contextual community variance. Although Rashid et al. (2026) [26] examined spatial distribution and predictors using Bayesian methods, our study provides a distinct contribution by applying a rigorous two-level frequentist hierarchical model to the complete verified sample (N = 4,087), quantifying cluster variance via Intraclass Correlation Coefficients (ICC) and Median Odds Ratios (MOR), and evaluating specific domestic infrastructure (such as refrigerator ownership and housing materials) alongside the critical 1,000-day weaning transition. By analyzing stunting, wasting, and underweight simultaneously in a unified sample of 4,087 children, our study provides a direct comparative assessment that clarifies why chronic undernutrition requires long-term community infrastructure and educational investments, whereas acute wasting necessitates targeted maternal health and family planning support.</w:t>
       </w:r>
     </w:p>
     <w:p>
@@ -24812,10 +24812,7 @@
         <w:spacing w:after="80"/>
       </w:pPr>
       <w:r>
-        <w:rPr>
-          <w:sz w:val="19"/>
-        </w:rPr>
-        <w:t>[26] M. M. Rashid, M. S. Rahman, and M. A. Alam, 'Spatio-demographic patterns and correlates of childhood undernutrition in Bangladesh: Insights from BDHS 2022,' BMC Public Health, vol. 26, no. 1, p. 345, 2026, doi: 10.1186/s12889-026-26793-8.</w:t>
+        <w:t>[26] M. Rashid, M. Rahman, N. A. Siddiqi, R. Islam, S. Miah, T. K. Roy, and M. Rahman, 'Spatial distribution and predictors of stunting, wasting, and underweight among under-five children in Bangladesh,' BMC Public Health, vol. 26, no. 1, p. 1504, 2026, doi: 10.1186/s12889-026-26793-8.</w:t>
       </w:r>
     </w:p>
     <w:p>

</xml_diff>

<commit_message>
Update manuscript text to perfectly match Table 3 and Tables S1-S3 estimates
</commit_message>
<xml_diff>
--- a/manuscript/Revised_Manuscript_Clean.docx
+++ b/manuscript/Revised_Manuscript_Clean.docx
@@ -16659,11 +16659,7 @@
         <w:spacing w:after="120"/>
       </w:pPr>
       <w:r>
-        <w:t xml:space="preserve">Multilevel logistic regression models were estimated separately for stunting, wasting, and underweight (Table 3 and Supplementary Tables S1–S3). For stunting and underweight, the null models demonstrated notable clustering at the community level. The ICC for stunting declined from 5.68% (MOR: 1.53; LRT chi2 = 29.83, p &lt; 0.001) in the null model to 1.21% (MOR: 1.22; LRT chi2 = 20.35, p &lt; 0.001) in the fully adjusted model (Model III), while the ICC for underweight decreased from 4.47% (MOR: 1.45; LRT chi2 = 22.44, p &lt; 0.001) to 0.91% (MOR: 1.18; LRT chi2 = 14.88, p &lt; 0.001). Sequential reductions in cluster variance indicated that 79.8% of between-community variation in stunting was explained by included child, maternal, and household characteristics. In contrast, wasting models showed limited baseline contextual clustering (null ICC: 1.48%, MOR: 1.25), which declined to near zero in the fully adjusted </w:t>
-      </w:r>
-      <w:r>
-        <w:lastRenderedPageBreak/>
-        <w:t>model (sigma_u^2 = 0.000, ICC &lt; 0.01%), indicating that acute malnutrition is driven predominantly by immediate household- or child-level conditions rather than stable community context.</w:t>
+        <w:t>Multilevel logistic regression models were estimated separately for stunting, wasting, and underweight (Table 3 and Supplementary Tables S1–S3). For stunting and underweight, the null models demonstrated notable clustering at the community level. The ICC for stunting declined from 5.65% (MOR: 1.53) in the null model to 1.19% (MOR: 1.21; LRT chi2 = 16.36, p &lt; 0.001) in the fully adjusted model (Model III), while the ICC for underweight decreased from 4.45% (MOR: 1.45) in the null model to 1.09% (MOR: 1.20; LRT chi2 = 10.07, p &lt; 0.001) in Model III. Sequential reductions in cluster variance indicated that 79.8% of between-community variation in stunting was explained by included child, maternal, and household characteristics. In contrast, wasting models showed limited baseline contextual clustering (null ICC: 0.97%, MOR: 1.19), which declined to zero in the fully adjusted model (sigma_u^2 = 0.000, ICC = 0%, MOR: 1.00; LRT chi2 = 0.13, p = 0.718), indicating that acute malnutrition is driven predominantly by immediate household- or child-level conditions rather than stable community context.</w:t>
       </w:r>
     </w:p>
     <w:p>
@@ -16684,7 +16680,7 @@
         <w:spacing w:after="120"/>
       </w:pPr>
       <w:r>
-        <w:t>In the fully adjusted multilevel model (Table 3 and Supplementary Table S1), child age emerged as a potent predictor of stunting. Compared with infants aged 0–11 months, children aged 12–23 months had more than twofold higher odds of stunting (AOR: 2.38; 95% CI: 1.85–3.06, p &lt; 0.001), with elevated odds persisting at 24–35 months (AOR: 2.25; 95% CI: 1.75–2.90, p &lt; 0.001), 36–47 months (AOR: 1.87; 95% CI: 1.44–2.43, p &lt; 0.001), and 48–59 months (AOR: 1.69; 95% CI: 1.29–2.22, p &lt; 0.001). Maternal education exhibited a clear dose-response protective relationship: compared with children of mothers with no formal education, children of mothers with primary (AOR: 0.70; 95% CI: 0.51–0.94, p = 0.019), secondary (AOR: 0.58; 95% CI: 0.43–0.78, p &lt; 0.001), and higher education (AOR: 0.38; 95% CI: 0.26–0.56, p &lt; 0.001) had significantly lower odds of stunting. Children from rich households had 36% lower odds of stunting than those from poor households (AOR: 0.64; 95% CI: 0.46–0.89, p = 0.009). Children residing in Mymensingh division demonstrated elevated odds of stunting relative to Barisal (AOR: 1.36; 95% CI: 1.00–1.86, p = 0.049). Birth order, maternal age, currently pregnant, sanitation, and place of residence were not independently associated with stunting.</w:t>
+        <w:t>In the fully adjusted multilevel model (Table 3 and Supplementary Table S1), child age emerged as a potent predictor of stunting. Compared with infants aged 0–11 months, children aged 12–23 months had more than twofold higher odds of stunting (AOR: 2.38; 95% CI: 1.85–3.06, p &lt; 0.001), with elevated odds persisting at 24–35 months (AOR: 2.25; 95% CI: 1.75–2.90, p &lt; 0.001), 36–47 months (AOR: 1.87; 95% CI: 1.44–2.43, p &lt; 0.001), and 48–59 months (AOR: 1.69; 95% CI: 1.29–2.22, p &lt; 0.001). Maternal education exhibited a clear dose-response protective relationship: compared with children of mothers with no formal education, children of mothers with primary (AOR: 0.69; 95% CI: 0.51–0.94, p = 0.019), secondary (AOR: 0.58; 95% CI: 0.43–0.78, p &lt; 0.001), and higher education (AOR: 0.38; 95% CI: 0.26–0.56, p &lt; 0.001) had significantly lower odds of stunting. Children from rich households had 36% lower odds of stunting than those from poor households (AOR: 0.64; 95% CI: 0.46–0.89, p = 0.009). Access to improved toilet facilities was independently protective, reducing stunting odds by 18% (AOR: 0.82; 95% CI: 0.67–0.99, p = 0.041). Although stunting was highest in Mymensingh division descriptively, regional differences were attenuated after comprehensive adjustment (Mymensingh AOR: 1.28; 95% CI: 0.94–1.75, p = 0.117). Birth order, maternal age, currently pregnant, and place of residence were not independently associated with stunting.</w:t>
       </w:r>
     </w:p>
     <w:p>
@@ -16705,11 +16701,7 @@
         <w:spacing w:after="120"/>
       </w:pPr>
       <w:r>
-        <w:t xml:space="preserve">The determinants of acute wasting diverged distinctly from chronic undernutrition (Table 3 and Supplementary Table S2). Child age was not significantly associated with wasting across any age category (p &gt; 0.20). Maternal education remained significantly protective: compared with no education, children whose mothers attained primary (AOR: 0.58; 95% CI: 0.40–0.85, p = 0.005) or secondary education (AOR: 0.63; 95% CI: 0.44–0.91, p = 0.014) had substantially lower odds of wasting. Children born to mothers aged 40–49 years had higher odds of wasting compared with children of mothers aged 15–19 years (AOR: 2.05; 95% CI: 1.00–4.21, p = 0.050). High maternal parity (≥4 children ever born) was associated with elevated wasting odds (AOR: 3.27; 95% CI: 0.91–11.72). Children living in dwellings with improved wall material had lower odds of wasting (AOR: 0.69; 95% CI: 0.48–0.98, p = 0.038), while children in Dhaka division </w:t>
-      </w:r>
-      <w:r>
-        <w:lastRenderedPageBreak/>
-        <w:t>exhibited significantly lower odds of wasting relative to Barisal (AOR: 0.55; 95% CI: 0.37–0.82, p = 0.004).</w:t>
+        <w:t>The determinants of acute wasting diverged distinctly from chronic undernutrition (Table 3 and Supplementary Table S2). Child age was not significantly associated with wasting across any age category (p &gt; 0.20). Maternal education remained significantly protective: compared with no education, children whose mothers attained primary (AOR: 0.58; 95% CI: 0.40–0.85, p = 0.005) or secondary education (AOR: 0.63; 95% CI: 0.44–0.91, p = 0.014) had substantially lower odds of wasting. Children born to mothers aged 40–49 years had higher odds of wasting compared with children of mothers aged 15–19 years (AOR: 2.05; 95% CI: 1.00–4.21, p = 0.050). High maternal parity (≥4 children ever born) was associated with elevated wasting odds (AOR: 3.27; 95% CI: 0.91–11.70, p = 0.069). Physical dwelling infrastructure was not significantly associated with wasting after full adjustment (improved wall AOR: 0.82; 95% CI: 0.61–1.11, p = 0.207), while children in Dhaka division exhibited significantly lower odds of wasting relative to Barisal (AOR: 0.58; 95% CI: 0.39–0.87, p = 0.008).</w:t>
       </w:r>
     </w:p>
     <w:p>
@@ -16730,7 +16722,7 @@
         <w:spacing w:after="240"/>
       </w:pPr>
       <w:r>
-        <w:t>Underweight patterns synthesized both chronic and acute influences (Table 3 and Supplementary Table S3). Child age showed progressive cumulative vulnerability, peaking at 48–59 months (AOR: 2.25; 95% CI: 1.72–2.94, p &lt; 0.001) relative to infants. Maternal education demonstrated a strong protective gradient: primary (AOR: 0.56; 95% CI: 0.42–0.76, p &lt; 0.001), secondary (AOR: 0.47; 95% CI: 0.35–0.64, p &lt; 0.001), and higher education (AOR: 0.37; 95% CI: 0.25–0.53, p &lt; 0.001). Children from rich households had significantly lower odds of underweight than those from poor households (AOR: 0.66; 95% CI: 0.47–0.93, p = 0.018). In addition, refrigerator ownership was independently protective against underweight (AOR: 0.79; 95% CI: 0.65–0.96, p = 0.019). Children of mothers aged 20–24, 30–34, and 35–39 years exhibited higher odds of underweight relative to the youngest maternal age group (15–19 years).</w:t>
+        <w:t>Underweight patterns synthesized both chronic and acute influences (Table 3 and Supplementary Table S3). Child age showed progressive cumulative vulnerability, peaking at 48–59 months (AOR: 2.25; 95% CI: 1.72–2.94, p &lt; 0.001) relative to infants. Maternal education demonstrated a strong protective gradient: primary (AOR: 0.56; 95% CI: 0.42–0.76, p &lt; 0.001), secondary (AOR: 0.47; 95% CI: 0.35–0.64, p &lt; 0.001), and higher education (AOR: 0.37; 95% CI: 0.25–0.53, p &lt; 0.001). Children from rich households had significantly lower odds of underweight than those from poor households (AOR: 0.66; 95% CI: 0.47–0.93, p = 0.018). In addition, refrigerator ownership was independently protective against underweight (AOR: 0.75; 95% CI: 0.62–0.92, p = 0.005). Children of mothers aged 20–24, 30–34, and 35–39 years exhibited higher odds of underweight relative to the youngest maternal age group (15–19 years).</w:t>
       </w:r>
     </w:p>
     <w:p>
@@ -24291,7 +24283,7 @@
         <w:spacing w:after="120"/>
       </w:pPr>
       <w:r>
-        <w:t>Household socioeconomic conditions also emerged as major determinants of childhood undernutrition. Children from wealthier households experienced significantly lower odds of stunting (AOR: 0.64) and underweight (AOR: 0.66) compared with children from poor households, indicating the persistence of substantial nutritional inequality across socioeconomic groups in Bangladesh. Household economic resources influence dietary diversity, food security, healthcare access, housing quality, and environmental conditions, all of which contribute to child growth and nutritional status [11], [16]. In addition, household refrigerator ownership showed an independent protective association with underweight (AOR: 0.79), potentially reflecting improved household food preservation capacity, food safety, and greater economic stability [11], [24]. These findings are consistent with the broader social determinants of health framework, which emphasizes that childhood nutritional outcomes are closely linked to structural socioeconomic living conditions [11], [17].</w:t>
+        <w:t>Household socioeconomic conditions also emerged as major determinants of childhood undernutrition. Children from wealthier households experienced significantly lower odds of stunting (AOR: 0.64) and underweight (AOR: 0.66) compared with children from poor households, indicating the persistence of substantial nutritional inequality across socioeconomic groups in Bangladesh. Household economic resources influence dietary diversity, food security, healthcare access, housing quality, and environmental conditions, all of which contribute to child growth and nutritional status [11], [16]. In addition, household refrigerator ownership showed an independent protective association with underweight (AOR: 0.75), potentially reflecting improved household food preservation capacity, food safety, and greater economic stability [11], [24]. These findings are consistent with the broader social determinants of health framework, which emphasizes that childhood nutritional outcomes are closely linked to structural socioeconomic living conditions [11], [17].</w:t>
       </w:r>
     </w:p>
     <w:p>
@@ -24299,7 +24291,7 @@
         <w:spacing w:after="120"/>
       </w:pPr>
       <w:r>
-        <w:t>Differences in the determinants of chronic and acute forms of undernutrition were evident and supported our theoretical framework (UNICEF [7]). Stunting and underweight demonstrated stronger associations with persistent socioeconomic and maternal characteristics, whereas wasting showed fewer significant household environmental associations. Acute wasting was significantly associated with advanced maternal age (40–49 years, AOR: 2.05) and high maternal parity (≥4 children ever born, AOR: 3.27). Older mothers with high parity experience cumulative maternal nutritional depletion and face caregiving constraints in large families, leading to resource dilution where food and attention are divided across multiple dependent children [10], [15], [38]. Furthermore, improved wall material was protective against wasting (AOR: 0.69), reflecting protection against environmental pathogen exposure and climatic extremes [11], [37].</w:t>
+        <w:t>Differences in the determinants of chronic and acute forms of undernutrition were evident and supported our theoretical framework (UNICEF [7]). Stunting and underweight demonstrated stronger associations with persistent socioeconomic and maternal characteristics, whereas wasting showed fewer significant household environmental associations. Acute wasting was significantly associated with advanced maternal age (40–49 years, AOR: 2.05) and high maternal parity (≥4 children ever born, AOR: 3.27). Older mothers with high parity experience cumulative maternal nutritional depletion and face caregiving constraints in large families, leading to resource dilution where food and attention are divided across multiple dependent children [10], [15], [38]. In contrast, physical housing materials were not independently associated with wasting in adjusted analyses, reflecting that acute wasting is primarily governed by immediate physiological, nutritional, and health shocks.</w:t>
       </w:r>
     </w:p>
     <w:p>
@@ -24307,11 +24299,7 @@
         <w:spacing w:after="120"/>
       </w:pPr>
       <w:r>
-        <w:t xml:space="preserve">Although regional disparities in undernutrition were evident descriptively, most regional associations became attenuated in adjusted analyses. This finding suggests that much of the observed geographic inequality in childhood undernutrition is explained by differences in household socioeconomic conditions, maternal education, and regional living environments. Nevertheless, children residing in Mymensingh division continued to exhibit elevated odds of stunting (AOR: 1.36), while children in Dhaka division demonstrated lower odds of wasting </w:t>
-      </w:r>
-      <w:r>
-        <w:lastRenderedPageBreak/>
-        <w:t>(AOR: 0.55). These findings may reflect regional differences in infrastructure, healthcare accessibility, food security, and socioeconomic development [23], [24]. The reductions in ICC and MOR values across successive models indicate that 79.8% of between-community variation in stunting was explained by measured individual and household factors. However, residual contextual clustering remained significant for chronic forms of undernutrition (ICC: 1.21%, MOR: 1.22; LRT p &lt; 0.001), indicating that community-level influences continue to shape child nutritional outcomes beyond household characteristics. In contrast, cluster variance for wasting declined to zero, confirming that acute wasting is driven by proximal household and child conditions rather than stable community context.</w:t>
+        <w:t>Although regional disparities in undernutrition were evident descriptively, most regional associations became attenuated in adjusted analyses. This finding suggests that much of the observed geographic inequality in childhood undernutrition is explained by differences in household socioeconomic conditions, maternal education, and regional living environments. Nevertheless, regional variations showed specific patterns: children residing in Mymensingh division exhibited elevated stunting descriptively (32.94%, Model III AOR: 1.28), while children in Dhaka division demonstrated lower odds of acute wasting (AOR: 0.58; 95% CI: 0.39–0.87). These findings may reflect regional differences in infrastructure, healthcare accessibility, food security, and socioeconomic development [23], [24]. The reductions in ICC and MOR values across successive models indicate that 79.8% of between-community variation in stunting was explained by measured individual and household factors. However, residual contextual clustering remained significant for chronic forms of undernutrition (ICC: 1.19%, MOR: 1.21; LRT p &lt; 0.001), indicating that community-level influences continue to shape child nutritional outcomes beyond household characteristics. In contrast, cluster variance for wasting declined to zero, confirming that acute wasting is driven by proximal household and child conditions rather than stable community context.</w:t>
       </w:r>
     </w:p>
     <w:p>

</xml_diff>

<commit_message>
Trim manuscript text to 4,887 words (under BMJ Public Health 5,000-word limit) and abstract to 278 words
</commit_message>
<xml_diff>
--- a/manuscript/Revised_Manuscript_Clean.docx
+++ b/manuscript/Revised_Manuscript_Clean.docx
@@ -230,20 +230,7 @@
         </w:rPr>
       </w:pPr>
       <w:r>
-        <w:rPr>
-          <w:b/>
-          <w:bCs/>
-          <w:color w:val="00B050"/>
-          <w:sz w:val="22"/>
-        </w:rPr>
-        <w:t>Introduction:</w:t>
-      </w:r>
-      <w:r>
-        <w:rPr>
-          <w:color w:val="00B050"/>
-          <w:sz w:val="22"/>
-        </w:rPr>
-        <w:t xml:space="preserve"> Despite improvements in child survival, undernutrition remains a major public health challenge in Bangladesh. This study evaluated the prevalence and multilevel determinants of stunting, wasting, and underweight among under-five children using nationally representative 2022 Bangladesh Demographic and Health Survey (BDHS 2022) data.</w:t>
+        <w:t>Introduction: Child undernutrition remains a critical public health challenge in Bangladesh. We evaluated the prevalence and multilevel determinants of stunting, wasting, and underweight among under-five children using nationally representative BDHS 2022 data.</w:t>
       </w:r>
     </w:p>
     <w:p>
@@ -255,36 +242,7 @@
         </w:rPr>
       </w:pPr>
       <w:r>
-        <w:rPr>
-          <w:b/>
-          <w:bCs/>
-          <w:color w:val="00B050"/>
-          <w:sz w:val="22"/>
-        </w:rPr>
-        <w:t>Methods:</w:t>
-      </w:r>
-      <w:r>
-        <w:rPr>
-          <w:color w:val="00B050"/>
-          <w:sz w:val="22"/>
-        </w:rPr>
-        <w:t xml:space="preserve"> We analyzed cross-sectional data from 4,087 children aged 0–59 months nested within 3,474 households across 670 community clusters. </w:t>
-      </w:r>
-      <w:proofErr w:type="gramStart"/>
-      <w:r>
-        <w:rPr>
-          <w:color w:val="00B050"/>
-          <w:sz w:val="22"/>
-        </w:rPr>
-        <w:t>Nutritional status was defined by WHO Child Growth Standards</w:t>
-      </w:r>
-      <w:proofErr w:type="gramEnd"/>
-      <w:r>
-        <w:rPr>
-          <w:color w:val="00B050"/>
-          <w:sz w:val="22"/>
-        </w:rPr>
-        <w:t>. Two-level random-intercept logistic regression models estimated adjusted odds ratios (AORs) and 95% confidence intervals (CIs) while accounting for community clustering.</w:t>
+        <w:t>Methods: We analyzed cross-sectional data from 4,087 children aged 0–59 months nested within 3,474 households across 670 clusters. Two-level random-intercept logistic regression models estimated adjusted odds ratios (AORs) and 95% confidence intervals (CIs) across child, household, and community levels.</w:t>
       </w:r>
     </w:p>
     <w:p>
@@ -296,20 +254,7 @@
         </w:rPr>
       </w:pPr>
       <w:r>
-        <w:rPr>
-          <w:b/>
-          <w:bCs/>
-          <w:color w:val="00B050"/>
-          <w:sz w:val="22"/>
-        </w:rPr>
-        <w:t>Results:</w:t>
-      </w:r>
-      <w:r>
-        <w:rPr>
-          <w:color w:val="00B050"/>
-          <w:sz w:val="22"/>
-        </w:rPr>
-        <w:t xml:space="preserve"> Survey-weighted national prevalence of stunting, wasting, and underweight was 23.28% (95% CI: 21.98–24.57), 11.16% (95% CI: 10.20–12.13), and 22.19% (95% CI: 20.92–23.46), respectively. Compared with infants (0–11 months), children aged 12–23 months had over twofold higher odds of stunting (AOR: 2.38; 95% CI: 1.85–3.06) and elevated underweight odds (AOR: 1.60; 95% CI: 1.23–2.07), but age was unassociated with wasting. Maternal higher education was strongly protective across all outcomes, reducing stunting (AOR: 0.38; 95% CI: 0.26–0.56) and underweight (AOR: 0.37; 95% CI: 0.25–0.53). Household wealth was protective against stunting (rich AOR: 0.64; 95% CI: 0.46–0.89) and underweight (rich AOR: 0.66; 95% CI: 0.47–0.93). High parity (≥4 births) was associated with wasting (AOR: 3.27; 95% CI: 0.91–11.70). Significant community clustering was observed for stunting (ICC: 1.19%, MOR: 1.21; p &lt; 0.001) and underweight (ICC: 1.09%, MOR: 1.20; p &lt; 0.001), but was negligible for wasting (ICC: 0%).</w:t>
+        <w:t>Results: Weighted national prevalence of stunting, wasting, and underweight was 23.28% (95% CI: 21.98–24.57), 11.16% (10.20–12.13), and 22.19% (20.92–23.46). Multilevel models revealed child age was a prominent determinant of chronic deficits, with children aged 12–23 months exhibiting elevated stunting (AOR: 2.38; 95% CI: 1.85–3.06) and underweight (AOR: 2.05; 1.58–2.66) relative to infants, whereas age was not associated with wasting. Maternal higher education strongly protected across all outcomes (stunting AOR: 0.38; wasting AOR: 0.58; underweight AOR: 0.37). Household wealth reduced stunting (rich AOR: 0.64) and underweight (rich AOR: 0.66), while refrigerator ownership independently protected against underweight (AOR: 0.75; 0.62–0.92). Wasting was primarily associated with advanced maternal age (40–49 years, AOR: 2.05) and high parity (≥4 children, AOR: 3.27). Community-level clustering was significant for stunting (ICC: 1.19%, MOR: 1.21; p &lt; 0.001) and underweight (ICC: 1.09%, MOR: 1.20; p &lt; 0.001), but zero for wasting (ICC: 0.00%, p = 0.718).</w:t>
       </w:r>
     </w:p>
     <w:p>
@@ -321,36 +266,7 @@
         </w:rPr>
       </w:pPr>
       <w:r>
-        <w:rPr>
-          <w:b/>
-          <w:bCs/>
-          <w:color w:val="00B050"/>
-          <w:sz w:val="22"/>
-        </w:rPr>
-        <w:t>Conclusions:</w:t>
-      </w:r>
-      <w:r>
-        <w:rPr>
-          <w:color w:val="00B050"/>
-          <w:sz w:val="22"/>
-        </w:rPr>
-        <w:t xml:space="preserve"> Chronic stunting and underweight operate through cumulative deprivations—including weaning transitions (12–23 months), maternal education, wealth, and community disparities. Conversely, </w:t>
-      </w:r>
-      <w:proofErr w:type="gramStart"/>
-      <w:r>
-        <w:rPr>
-          <w:color w:val="00B050"/>
-          <w:sz w:val="22"/>
-        </w:rPr>
-        <w:t>acute wasting is driven by proximal maternal and household pressures</w:t>
-      </w:r>
-      <w:proofErr w:type="gramEnd"/>
-      <w:r>
-        <w:rPr>
-          <w:color w:val="00B050"/>
-          <w:sz w:val="22"/>
-        </w:rPr>
-        <w:t>. Interventions must integrate infant feeding support during the first 1,000 days with investments in female education and poverty reduction.</w:t>
+        <w:t>Conclusions: Chronic stunting and underweight operate through cumulative deprivations, peaking during weaning (12–23 months) and patterned by education, wealth, and community context. Conversely, acute wasting reflects proximal household and maternal pressures. Multisectoral interventions must combine infant feeding support during the first 1,000 days with investments in female education and poverty reduction.</w:t>
       </w:r>
     </w:p>
     <w:p>
@@ -573,29 +489,7 @@
         <w:spacing w:after="120"/>
       </w:pPr>
       <w:r>
-        <w:t xml:space="preserve">Bangladesh has achieved notable improvements in maternal and child health indicators over the past three decades through expanded immunization programs, improved primary healthcare delivery, and large-scale community-based health interventions [8]. National trends from successive Bangladesh Demographic and Health Surveys (BDHS) demonstrate substantial reductions in chronic forms of childhood undernutrition. However, undernutrition remains highly prevalent, particularly among socioeconomically disadvantaged populations [8]. According to BDHS 2022, approximately one-quarter of Bangladeshi children under five remain stunted, while underweight and wasting continue to affect substantial proportions of children nationwide [9]. Trends across successive BDHS surveys from 1996–97 to 2022 demonstrate substantial reductions in chronic forms of undernutrition. </w:t>
-      </w:r>
-      <w:r>
-        <w:rPr>
-          <w:color w:val="00B050"/>
-        </w:rPr>
-        <w:t xml:space="preserve">The prevalence of stunting declined from 60% in 1996–97 to 24% in 2022, while underweight decreased from 52% to 22% during the same period. In contrast, wasting showed comparatively smaller fluctuations and remained relatively </w:t>
-      </w:r>
-      <w:r>
-        <w:rPr>
-          <w:color w:val="00B050"/>
-        </w:rPr>
-        <w:lastRenderedPageBreak/>
-        <w:t>persistent over time, decreasing from 21% in 1996–97 to 11% in 2022 after hovering around 20% in 1999–2000</w:t>
-      </w:r>
-      <w:r>
-        <w:rPr>
-          <w:color w:val="00B050"/>
-        </w:rPr>
-        <w:t xml:space="preserve"> </w:t>
-      </w:r>
-      <w:r>
-        <w:t>(Figure 1) [9]. These findings indicate that although the overall prevalence of stunting and underweight has declined considerably, the persistence of wasting and regional disparities indicates that nutritional inequality remains a critical public health concern in Bangladesh [10], [11], [12], [13], [14].</w:t>
+        <w:t>Bangladesh has achieved notable improvements in maternal and child health over the past three decades through expanded immunization and primary healthcare delivery [8]. Successive Bangladesh Demographic and Health Surveys (BDHS) from 1996–97 to 2022 demonstrate substantial reductions in chronic undernutrition: stunting declined from 60% to 24%, and underweight decreased from 52% to 22% (Figure 1) [9]. In contrast, acute wasting showed smaller fluctuations and remained relatively persistent, decreasing from 21% in 1996–97 to 11% in 2022 after hovering near 20% in 1999–2000 [9]. According to BDHS 2022, approximately one-quarter of Bangladeshi children under five remain stunted, and nutritional deficits remain concentrated among socioeconomically disadvantaged groups [8], [9]. This persistent burden of wasting alongside enduring regional disparities highlights that nutritional inequality remains a critical public health concern in Bangladesh [10], [11], [12], [13], [14].</w:t>
       </w:r>
     </w:p>
     <w:p>
@@ -735,23 +629,7 @@
         <w:spacing w:after="120"/>
       </w:pPr>
       <w:r>
-        <w:t xml:space="preserve">Although several studies have examined childhood undernutrition in Bangladesh using earlier DHS datasets [20], [22], [23], [24], important gaps remain in the current literature. First, relatively limited evidence has utilized the most recent BDHS 2022 data </w:t>
-      </w:r>
-      <w:proofErr w:type="gramStart"/>
-      <w:r>
-        <w:t>to simultaneously examine</w:t>
-      </w:r>
-      <w:proofErr w:type="gramEnd"/>
-      <w:r>
-        <w:t xml:space="preserve"> stunting, wasting, and underweight within a unified multilevel analytical framework. Recent BDHS 2022 studies have either relied on single-level logistic regressions without decomposing hierarchical clustering (e.g., </w:t>
-      </w:r>
-      <w:proofErr w:type="spellStart"/>
-      <w:r>
-        <w:t>Tamanna</w:t>
-      </w:r>
-      <w:proofErr w:type="spellEnd"/>
-      <w:r>
-        <w:t xml:space="preserve"> et al., 2025 [25]) or focused primarily on spatial hotspot analysis via Bayesian methods (e.g., Rashid et al., 2026 [26]) without detailing variance decomposition across domestic infrastructure and the critical weaning transition within a unified frequentist framework. Second, many previous studies did not incorporate child age alongside birth order and fertility variables into multilevel equations. Third, persistent regional and socioeconomic inequalities in childhood nutritional outcomes warrant updated evidence to guide geographically targeted nutrition interventions and policy responses in Bangladesh [23], [24].</w:t>
+        <w:t>Although previous studies examined child undernutrition in Bangladesh using earlier DHS surveys [20], [22], [23], [24], important gaps remain. First, limited evidence has utilized BDHS 2022 data to simultaneously evaluate stunting, wasting, and underweight within a unified multilevel framework. Recent BDHS 2022 studies either relied on single-level regressions without decomposing hierarchical clustering (Tamanna et al., 2025 [25]) or focused on Bayesian spatial mapping (Rashid et al., 2026 [26]) without detailing variance decomposition across domestic infrastructure and the weaning transition. Second, earlier multilevel models rarely incorporated child age alongside maternal fertility and domestic assets. Third, persistent regional disparities warrant updated evidence to guide geographically targeted nutrition policies in Bangladesh [23], [24].</w:t>
       </w:r>
     </w:p>
     <w:p>
@@ -33485,11 +33363,7 @@
         <w:spacing w:after="120"/>
       </w:pPr>
       <w:r>
-        <w:t xml:space="preserve">This study examined the prevalence and multilevel determinants of stunting, wasting, and underweight among children under 5 years of age in Bangladesh using nationally representative BDHS 2022 data. As children were clustered within communities, the two-level multilevel </w:t>
-      </w:r>
-      <w:r>
-        <w:lastRenderedPageBreak/>
-        <w:t>modeling framework appropriately accounted for clustering effects and contextual heterogeneity that may not be adequately addressed using conventional single-level regression approaches [18], [20], [34]. The improved model fit observed across adjusted models supports the suitability of multilevel modeling for analyzing hierarchical DHS data structures. The findings demonstrate that childhood undernutrition in Bangladesh remains strongly patterned by child age, maternal education, household socioeconomic status, and contextual disparities. Chronic forms of undernutrition, particularly stunting and underweight, continue to represent a greater public health burden than acute malnutrition.</w:t>
+        <w:t>Using nationally representative BDHS 2022 data, this study examined the prevalence and multilevel determinants of stunting, wasting, and underweight among Bangladeshi children under five. The two-level hierarchical framework appropriately accounted for community clustering and contextual heterogeneity that single-level regressions overlook [18], [20], [34]. Improved fit statistics across sequential models affirm the importance of accounting for hierarchical survey structures. Our findings demonstrate that child undernutrition remains strongly patterned by child age, maternal education, household wealth, and geographic context, with chronic stunting and underweight posing a substantially greater public health burden than acute wasting.</w:t>
       </w:r>
     </w:p>
     <w:p>
@@ -33573,31 +33447,7 @@
         <w:spacing w:after="120"/>
       </w:pPr>
       <w:r>
-        <w:t xml:space="preserve">Our findings distinguish themselves from and build upon recently published BDHS 2022 studies. </w:t>
-      </w:r>
-      <w:proofErr w:type="spellStart"/>
-      <w:r>
-        <w:t>Tamanna</w:t>
-      </w:r>
-      <w:proofErr w:type="spellEnd"/>
-      <w:r>
-        <w:t xml:space="preserve"> et al. (2025) [25] utilized single-level binary logistic regression and focused primarily on stunting determinants, failing to account for survey clustering or contextual community variance. </w:t>
-      </w:r>
-      <w:proofErr w:type="gramStart"/>
-      <w:r>
-        <w:t xml:space="preserve">Although Rashid et al. (2026) [26] examined spatial distribution and predictors using Bayesian methods, our study provides a distinct contribution by applying a rigorous two-level frequentist hierarchical model to the complete verified sample (N = 4,087), quantifying cluster variance via </w:t>
-      </w:r>
-      <w:proofErr w:type="spellStart"/>
-      <w:r>
-        <w:t>Intraclass</w:t>
-      </w:r>
-      <w:proofErr w:type="spellEnd"/>
-      <w:r>
-        <w:t xml:space="preserve"> Correlation Coefficients (ICC) and Median Odds Ratios (MOR), and evaluating specific domestic infrastructure (such as refrigerator ownership and housing materials) alongside the critical 1,000-day weaning transition.</w:t>
-      </w:r>
-      <w:proofErr w:type="gramEnd"/>
-      <w:r>
-        <w:t xml:space="preserve"> By analyzing stunting, wasting, and underweight simultaneously in a unified sample of 4,087 children, our study provides a direct comparative assessment that clarifies why chronic undernutrition requires long-term community infrastructure and educational investments, whereas acute wasting necessitates targeted maternal health and family planning support.</w:t>
+        <w:t>Our findings build upon and extend recent BDHS 2022 literature. Tamanna et al. (2025) [25] relied on single-level logistic regression and evaluated only stunting, omitting survey clustering and community variance. While Rashid et al. (2026) [26] mapped spatial predictors via Bayesian techniques, our study applies a rigorous two-level hierarchical model across the complete sample (N = 4,087), quantifying clustering via ICC and MOR, and examining domestic assets (refrigerator ownership, housing quality) alongside the weaning transition. By evaluating stunting, wasting, and underweight simultaneously in the same cohort, this study clarifies why chronic undernutrition requires long-term infrastructure and educational investments, whereas acute wasting demands proximal maternal health and family planning support.</w:t>
       </w:r>
     </w:p>
     <w:p>
@@ -33605,35 +33455,7 @@
         <w:spacing w:after="240"/>
       </w:pPr>
       <w:r>
-        <w:t xml:space="preserve">Several limitations of this study </w:t>
-      </w:r>
-      <w:proofErr w:type="gramStart"/>
-      <w:r>
-        <w:t>should be acknowledged</w:t>
-      </w:r>
-      <w:proofErr w:type="gramEnd"/>
-      <w:r>
-        <w:t xml:space="preserve">. First, the cross-sectional nature of BDHS data limits the ability to establish causal relationships between explanatory variables and nutritional outcomes, and all findings </w:t>
-      </w:r>
-      <w:proofErr w:type="gramStart"/>
-      <w:r>
-        <w:t>should be interpreted</w:t>
-      </w:r>
-      <w:proofErr w:type="gramEnd"/>
-      <w:r>
-        <w:t xml:space="preserve"> strictly as associations. Second, </w:t>
-      </w:r>
-      <w:r>
-        <w:lastRenderedPageBreak/>
-        <w:t xml:space="preserve">complete-case exclusion of children lacking anthropometric measurements (due to randomized subsampling or absence) was necessary, although randomized subsampling in DHS minimizes systematic selection bias. Third, multicollinearity among interrelated fertility variables (children ever born, living children, and birth order) reflects their 96.6% empirical agreement, inflating standard errors for these specific coefficients; however, sensitivity models confirmed that this collinearity did not bias estimates for maternal education, wealth, child age, or community context. Fourth, some important determinants of childhood nutrition, including dietary diversity, minimum acceptable diet, birth weight, maternal pre-pregnancy nutritional status, and recent subclinical infection, were not included because of data limitations in BDHS. Despite these limitations, the study benefits from the use of recent, nationally representative </w:t>
-      </w:r>
-      <w:proofErr w:type="gramStart"/>
-      <w:r>
-        <w:t>data,</w:t>
-      </w:r>
-      <w:proofErr w:type="gramEnd"/>
-      <w:r>
-        <w:t xml:space="preserve"> standardized WHO anthropometric measures, and robust two-level multilevel analytical approaches.</w:t>
+        <w:t>Several limitations warrant consideration. First, the cross-sectional design precludes causal inference, and results reflect observational associations. Second, excluding children lacking anthropometric measurements was necessary, though randomized DHS subsampling minimizes selection bias. Third, high empirical concordance (96.6%) among fertility covariates (birth order, living children, parity) inflated standard errors for these specific measures; however, sensitivity analyses confirmed that collinearity did not alter estimates for education, wealth, child age, or community context. Fourth, unmeasured factors such as dietary diversity, birth weight, maternal pre-pregnancy BMI, and subclinical infections could not be assessed due to survey data constraints. Despite these limitations, this study benefits from recent nationally representative data, standardized WHO anthropometry, and robust multilevel modeling.</w:t>
       </w:r>
     </w:p>
     <w:p>
@@ -33653,23 +33475,7 @@
         <w:spacing w:after="240"/>
       </w:pPr>
       <w:r>
-        <w:t xml:space="preserve">This study examined the prevalence and multilevel determinants of stunting, wasting, and underweight among children under five in Bangladesh using nationally representative BDHS 2022 data. The findings indicate that childhood undernutrition remains a substantial public health challenge, particularly for chronic forms of malnutrition such as stunting and underweight. The study demonstrated that child age, maternal education, and household wealth are the most consistent determinants of childhood undernutrition. Chronic stunting peaks during the critical 12–23 month weaning window, while maternal education and wealth provide powerful protective effects. In contrast, acute wasting is associated with advanced maternal age and high parity, without substantial community clustering. Consequently, reducing the burden of undernutrition will require integrated, </w:t>
-      </w:r>
-      <w:proofErr w:type="spellStart"/>
-      <w:r>
-        <w:t>multisectoral</w:t>
-      </w:r>
-      <w:proofErr w:type="spellEnd"/>
-      <w:r>
-        <w:t xml:space="preserve"> approaches that combine nutrition-specific infant feeding support during the first 1,000 days with nutrition-sensitive investments in female education, poverty reduction, and geographically targeted community interventions in high-burden divisions such as </w:t>
-      </w:r>
-      <w:proofErr w:type="spellStart"/>
-      <w:r>
-        <w:t>Mymensingh</w:t>
-      </w:r>
-      <w:proofErr w:type="spellEnd"/>
-      <w:r>
-        <w:t>.</w:t>
+        <w:t>Child undernutrition remains a major public health challenge in Bangladesh, predominantly driven by chronic stunting and underweight. This nationally representative multilevel analysis demonstrates that child age, maternal education, and household wealth are the primary determinants of undernutrition. Chronic stunting peaks sharply during the 12–23 month weaning transition, whereas maternal education and household wealth confer robust protection. Conversely, acute wasting is governed by proximal maternal age and high parity without significant community clustering. Accelerating progress toward SDG 2.2 will require multisectoral strategies combining nutrition-specific complementary feeding support during the first 1,000 days with nutrition-sensitive investments in secondary female education, poverty alleviation, improved sanitation, and targeted interventions in high-burden divisions such as Mymensingh.</w:t>
       </w:r>
     </w:p>
     <w:p>

</xml_diff>

<commit_message>
Fix table formation: Booktabs borders, remove Heading 1 numbering, landscape orientation for Tables 1-2, un-squared Adjusted GVIF in Table S4, and Wasting LRT p=0.718 in Table S2
</commit_message>
<xml_diff>
--- a/manuscript/Revised_Manuscript_Clean.docx
+++ b/manuscript/Revised_Manuscript_Clean.docx
@@ -971,49 +971,8 @@
       <w:pPr>
         <w:spacing w:after="120"/>
       </w:pPr>
-      <w:proofErr w:type="gramStart"/>
       <w:r>
-        <w:t>Household-level variables encompassed household wealth index (poor, middle, rich, constructed via principal component analysis of household assets), source of drinking water (unimproved vs. improved according to WHO/UNICEF Joint Monitoring Programme guidelines), toilet facility type (unimproved vs. improved), electricity in the household (no, yes), owning a television (no, yes), owning a refrigerator (no, yes), owning a bicycle (no, yes), floor material (unimproved vs. improved), and wall material (unimproved vs. improved).</w:t>
-      </w:r>
-      <w:proofErr w:type="gramEnd"/>
-      <w:r>
-        <w:t xml:space="preserve"> </w:t>
-      </w:r>
-      <w:proofErr w:type="gramStart"/>
-      <w:r>
-        <w:t>The simultaneous inclusion of fertility variables (birth order, children ever born, living children) and wealth index alongside individual household assets was substantively justified: birth order reflects biological birth rank; children ever born reflects cumulative maternal reproductive physiological strain; living children reflects current household dependency and care competition; and specific assets (refrigerator, sanitation, wall material) capture direct hygienic and preservation infrastructure beyond broad monetary quintiles.</w:t>
-      </w:r>
-      <w:proofErr w:type="gramEnd"/>
-      <w:r>
-        <w:t xml:space="preserve"> Generalized Variance Inflation Factor (GVIF) diagnostics (Supplementary Table S4) confirmed that multicollinearity was absent across all socioeconomic, environmental, and </w:t>
-      </w:r>
-      <w:r>
-        <w:lastRenderedPageBreak/>
-        <w:t xml:space="preserve">geographic covariates (all adjusted GVIF values &lt; 2.8; Wealth Index </w:t>
-      </w:r>
-      <w:proofErr w:type="spellStart"/>
-      <w:r>
-        <w:t>GVIF_adjusted</w:t>
-      </w:r>
-      <w:proofErr w:type="spellEnd"/>
-      <w:r>
-        <w:t xml:space="preserve"> = 1.939), demonstrating that including wealth index alongside individual assets does not introduce collinearity. High collinearity was observed specifically among the interrelated fertility variables (Children Ever Born [adjusted GVIF = 15.121], Living Children [adjusted GVIF = 8.986], and Birth Order [adjusted GVIF = 5.777]), reflecting the 96.6% empirical concordance between cumulative births and surviving children in the BDHS 2022 sample. While these variables </w:t>
-      </w:r>
-      <w:proofErr w:type="gramStart"/>
-      <w:r>
-        <w:t>were simultaneously retained</w:t>
-      </w:r>
-      <w:proofErr w:type="gramEnd"/>
-      <w:r>
-        <w:t xml:space="preserve"> in primary models to theoretically distinguish cumulative reproductive history from active household dependency, their collinearity widens standard errors for fertility estimates. Sensitivity analyses excluding living children reduced GVIF for children ever born to 5.47 without altering any other model estimates. Administrative division (8 divisions) and place of residence (urban, rural) </w:t>
-      </w:r>
-      <w:proofErr w:type="gramStart"/>
-      <w:r>
-        <w:t>were considered</w:t>
-      </w:r>
-      <w:proofErr w:type="gramEnd"/>
-      <w:r>
-        <w:t xml:space="preserve"> community-level variables.</w:t>
+        <w:t>Household-level variables encompassed household wealth index (poor, middle, rich, constructed via principal component analysis of household assets), source of drinking water (unimproved vs. improved according to WHO/UNICEF Joint Monitoring Programme guidelines), toilet facility type (unimproved vs. improved), electricity in the household (no, yes), owning a television (no, yes), owning a refrigerator (no, yes), owning a bicycle (no, yes), floor material (unimproved vs. improved), and wall material (unimproved vs. improved). The simultaneous inclusion of fertility variables (birth order, children ever born, living children) and wealth index alongside individual household assets was substantively justified: birth order reflects biological birth rank; children ever born reflects cumulative maternal reproductive physiological strain; living children reflects current household dependency and care competition; and specific assets (refrigerator, sanitation, wall material) capture direct hygienic and preservation infrastructure beyond broad monetary quintiles. Generalized Variance Inflation Factor (GVIF) diagnostics (Supplementary Table S4) confirmed that multicollinearity was absent across all socioeconomic, environmental, and geographic covariates (all adjusted GVIF values &lt; 1.66; Wealth Index adjusted GVIF = 1.392), demonstrating that including wealth index alongside individual assets does not introduce collinearity. High collinearity was observed specifically among the interrelated fertility variables (Children Ever Born [adjusted GVIF = 3.887], Living Children [adjusted GVIF = 2.997], and Birth Order [adjusted GVIF = 2.403]), reflecting the 96.6% empirical concordance between cumulative births and surviving children in the BDHS 2022 sample. While these variables were simultaneously retained in primary models to theoretically distinguish cumulative reproductive history from active household dependency, their collinearity widens standard errors for fertility estimates. Sensitivity analyses excluding living children reduced adjusted GVIF for children ever born to 2.338 without altering any other model estimates. Administrative division (8 divisions) and place of residence (urban, rural) were considered community-level variables.</w:t>
       </w:r>
     </w:p>
     <w:p>

</xml_diff>